<commit_message>
Fill in instructor, student, and manager names in lesson guide
Co-Authored-By: Claude Opus 5.5 <noreply@anthropic.com>
Claude-Session: https://claude.ai/code/session_011DJ4caanEAH2wYPenuQups
</commit_message>
<xml_diff>
--- a/docs/国語授業ガイド_中3高校受験_講師向け.docx
+++ b/docs/国語授業ガイド_中3高校受験_講師向け.docx
@@ -30,7 +30,7 @@
           <w:sz w:val="21"/>
           <w:szCs w:val="21"/>
         </w:rPr>
-        <w:t xml:space="preserve">〇〇先生</w:t>
+        <w:t xml:space="preserve">松本先生</w:t>
       </w:r>
     </w:p>
     <w:p>
@@ -58,21 +58,21 @@
           <w:sz w:val="21"/>
           <w:szCs w:val="21"/>
         </w:rPr>
-        <w:t xml:space="preserve">このたびは、中3の〇〇くんの国語の授業をご担当いただき、ありがとうございます。</w:t>
-      </w:r>
-    </w:p>
-    <w:p>
-      <w:pPr>
-        <w:spacing w:after="60" w:line="300"/>
-      </w:pPr>
-      <w:r>
-        <w:rPr>
-          <w:rFonts w:ascii="游明朝" w:cs="游明朝" w:eastAsia="游明朝" w:hAnsi="游明朝"/>
-          <w:color w:val="000000"/>
-          <w:sz w:val="21"/>
-          <w:szCs w:val="21"/>
-        </w:rPr>
-        <w:t xml:space="preserve">〇〇くんから「国語の解き方を分かりやすく教えてほしい」という依頼がありました。この資料は、授業で教える解き方と授業の進め方をまとめたものです。この資料の通りに進めていただければ、初めての先生でも満足してもらえる授業ができるように作っています。</w:t>
+        <w:t xml:space="preserve">このたびは、中3の鈴木くんの国語の授業をご担当いただき、ありがとうございます。</w:t>
+      </w:r>
+    </w:p>
+    <w:p>
+      <w:pPr>
+        <w:spacing w:after="60" w:line="300"/>
+      </w:pPr>
+      <w:r>
+        <w:rPr>
+          <w:rFonts w:ascii="游明朝" w:cs="游明朝" w:eastAsia="游明朝" w:hAnsi="游明朝"/>
+          <w:color w:val="000000"/>
+          <w:sz w:val="21"/>
+          <w:szCs w:val="21"/>
+        </w:rPr>
+        <w:t xml:space="preserve">鈴木くんから「国語の解き方を分かりやすく教えてほしい」という依頼がありました。この資料は、授業で教える解き方と授業の進め方をまとめたものです。この資料の通りに進めていただければ、初めての先生でも満足してもらえる授業ができるように作っています。</w:t>
       </w:r>
     </w:p>
     <w:p>
@@ -986,7 +986,7 @@
           <w:sz w:val="21"/>
           <w:szCs w:val="21"/>
         </w:rPr>
-        <w:t xml:space="preserve">「確認して次回お伝えするね」で大丈夫です。教室長に相談してください。</w:t>
+        <w:t xml:space="preserve">「確認して次回お伝えするね」で大丈夫です。坪井までご相談ください。</w:t>
       </w:r>
     </w:p>
     <w:p>
@@ -4369,7 +4369,7 @@
           <w:sz w:val="21"/>
           <w:szCs w:val="21"/>
         </w:rPr>
-        <w:t xml:space="preserve">〇〇くんの様子で気になることがあれば、その日のうちに教室長に共有してください。</w:t>
+        <w:t xml:space="preserve">鈴木くんの様子で気になることがあれば、その日のうちに坪井まで共有してください。</w:t>
       </w:r>
     </w:p>
     <w:p>
@@ -4411,7 +4411,7 @@
           <w:sz w:val="21"/>
           <w:szCs w:val="21"/>
         </w:rPr>
-        <w:t xml:space="preserve">〇〇くんが「国語が分かるようになった」と思える授業を、一緒につくっていきましょう。</w:t>
+        <w:t xml:space="preserve">鈴木くんが「国語が分かるようになった」と思える授業を、一緒につくっていきましょう。</w:t>
       </w:r>
     </w:p>
     <w:p>
@@ -4454,7 +4454,7 @@
           <w:sz w:val="21"/>
           <w:szCs w:val="21"/>
         </w:rPr>
-        <w:t xml:space="preserve">〇〇教室　教室長　〇〇</w:t>
+        <w:t xml:space="preserve">教室長　坪井</w:t>
       </w:r>
     </w:p>
     <w:sectPr>

</xml_diff>